<commit_message>
Archive is US-only: Dutch and EU built-ins are gone and the demo is American
nl_bsn (with the elfproef), vat_id, iban and their checks are removed,
along with the Dutch, German, French and Belgian national id schemes,
postcodes and subdivisions, the NL date layout, Dutch-only name
particles and the Dutch, German and French country names. The demo
vault is now Jordan Ellis in Brooklyn: an IRS refund notice, a pay
stub, an Aetna plan summary, a Park Slope Dental invoice, a lease,
Chase and Con Edison files and the rest, regenerated in English. The
e2e tests read en-US input and English search text, and the docs and
site use American examples and spelling. demo/README.md, which
repeated the README's Develop section, is gone.

Co-Authored-By: Claude Opus 5.5 <noreply@anthropic.com>
</commit_message>
<xml_diff>
--- a/demo/files/Letter to landlord.docx
+++ b/demo/files/Letter to landlord.docx
@@ -14,7 +14,7 @@
           <w:b/>
           <w:spacing w:val="0"/>
         </w:rPr>
-        <w:t xml:space="preserve">Letter to Jordaan Vastgoed</w:t>
+        <w:t xml:space="preserve">Letter to Union Street Properties</w:t>
       </w:r>
     </w:p>
     <w:p>
@@ -110,7 +110,7 @@
           <w:sz-cs w:val="24"/>
           <w:spacing w:val="0"/>
         </w:rPr>
-        <w:t xml:space="preserve">3 September</w:t>
+        <w:t xml:space="preserve">September 3</w:t>
       </w:r>
     </w:p>
     <w:p>
@@ -134,7 +134,7 @@
           <w:sz-cs w:val="24"/>
           <w:spacing w:val="0"/>
         </w:rPr>
-        <w:t xml:space="preserve">12 October</w:t>
+        <w:t xml:space="preserve">October 12</w:t>
       </w:r>
     </w:p>
     <w:p>
@@ -148,7 +148,7 @@
           <w:sz-cs w:val="24"/>
           <w:spacing w:val="0"/>
         </w:rPr>
-        <w:t xml:space="preserve">Kind regards, Marijn</w:t>
+        <w:t xml:space="preserve">Best, Jordan</w:t>
       </w:r>
     </w:p>
     <w:sectPr/>

</xml_diff>